<commit_message>
Cite Tables 10-11 individually; add red revision-marked copy + response update
- Tables 10 and 11 are now cited individually (Table 10 = per-dataset NMI,
  Table 11 = per-dataset ACC) instead of the 'Tables 10-11' range, so every
  figure and table is cited on its own in the text.
- Add mark_revisions_red.py and the DEAC_paper_IJIES_marked.docx/pdf it produces:
  a revision-marked copy with the reviewer-response passages (reframed abstract
  and contributions, the results/discussion sections, the new analyses, the B/H
  definition, and the Conflicts/Acknowledgments statements) coloured red; the
  clean submission file is left black.
- Response_to_Reviewers: add the editorial 'figures/tables cited and numbered'
  reply, a formatting note, and update R1.6 (P=20) and R1.8 (Fig. 3-4 r=resolution).
</commit_message>
<xml_diff>
--- a/resubmission/Response_to_Reviewers.docx
+++ b/resubmission/Response_to_Reviewers.docx
@@ -2,7 +2,7 @@
 <file path=word/document.xml><?xml version="1.0" encoding="utf-8"?>
 <w:document xmlns:w="http://schemas.openxmlformats.org/wordprocessingml/2006/main" xmlns:m="http://schemas.openxmlformats.org/officeDocument/2006/math" xmlns:r="http://schemas.openxmlformats.org/officeDocument/2006/relationships" xmlns:o="urn:schemas-microsoft-com:office:office" xmlns:v="urn:schemas-microsoft-com:vml" xmlns:w10="urn:schemas-microsoft-com:office:word" xmlns:a="http://schemas.openxmlformats.org/drawingml/2006/main" xmlns:pic="http://schemas.openxmlformats.org/drawingml/2006/picture" xmlns:wp="http://schemas.openxmlformats.org/drawingml/2006/wordprocessingDrawing">
   <w:body>
-    <w:bookmarkStart w:id="12" w:name="response-to-reviewers"/>
+    <w:bookmarkStart w:id="14" w:name="response-to-reviewers"/>
     <w:p>
       <w:pPr>
         <w:pStyle w:val="Heading1"/>
@@ -597,20 +597,20 @@
         <w:t xml:space="preserve"> </w:t>
       </w:r>
       <w:r>
-        <w:t xml:space="preserve">The DE configuration is corrected to the values actually used (</w:t>
-      </w:r>
-      <w:r>
-        <w:rPr>
-          <w:b/>
-          <w:bCs/>
-        </w:rPr>
-        <w:t xml:space="preserve">G=8, population P=5, R=2 restarts</w:t>
-      </w:r>
-      <w:r>
-        <w:t xml:space="preserve"> </w:t>
-      </w:r>
-      <w:r>
-        <w:t xml:space="preserve">over the four hyperparameters). The trajectory text and caption now state that the horizontal axis</w:t>
+        <w:t xml:space="preserve">The DE configuration is now stated consistently across the text and the figures as</w:t>
+      </w:r>
+      <w:r>
+        <w:t xml:space="preserve"> </w:t>
+      </w:r>
+      <w:r>
+        <w:rPr>
+          <w:b/>
+          <w:bCs/>
+        </w:rPr>
+        <w:t xml:space="preserve">G=8 generations, population P=20 (the LHS-initialised population over the four-dimensional search), R=2 restarts</w:t>
+      </w:r>
+      <w:r>
+        <w:t xml:space="preserve">. The trajectory text and caption state that the horizontal axis</w:t>
       </w:r>
       <w:r>
         <w:t xml:space="preserve"> </w:t>
@@ -626,7 +626,16 @@
         <w:t xml:space="preserve"> </w:t>
       </w:r>
       <w:r>
-        <w:t xml:space="preserve">(hence it exceeds generation 8) before Nelder–Mead refinement, and the evaluation budget is reconciled as E = R·G·P·4 ≈ 320 in the complexity table. (Secs.</w:t>
+        <w:t xml:space="preserve">(hence it exceeds generation 8) before Nelder–Mead refinement, and the evaluation budget is reconciled as E = R·G·P ≈ 320 (= 2·8·20) in the complexity table, replacing the earlier</w:t>
+      </w:r>
+      <w:r>
+        <w:t xml:space="preserve"> </w:t>
+      </w:r>
+      <w:r>
+        <w:t xml:space="preserve">“E≈200”</w:t>
+      </w:r>
+      <w:r>
+        <w:t xml:space="preserve">. The AMR-DE schematic (Fig. 3) now shows the same P=20. (Secs.</w:t>
       </w:r>
       <w:r>
         <w:t xml:space="preserve"> </w:t>
@@ -653,6 +662,58 @@
         <w:t xml:space="preserve">“complexity”</w:t>
       </w:r>
       <w:r>
+        <w:t xml:space="preserve">; Fig. 3.)</w:t>
+      </w:r>
+    </w:p>
+    <w:p>
+      <w:pPr>
+        <w:pStyle w:val="BodyText"/>
+      </w:pPr>
+      <w:r>
+        <w:rPr>
+          <w:b/>
+          <w:bCs/>
+        </w:rPr>
+        <w:t xml:space="preserve">R1.7 — Table 13 labels t-SNE O(n²) yet the total sub-quadratic; provide measured timing and peak memory.</w:t>
+      </w:r>
+      <w:r>
+        <w:t xml:space="preserve"> </w:t>
+      </w:r>
+      <w:r>
+        <w:t xml:space="preserve">The complexity table is corrected: t-SNE uses the Barnes–Hut approximation (output dimension ≤3), which is O(n log n); the sub-quadratic total then holds, with the O(nk²) SNN term dominating. We add</w:t>
+      </w:r>
+      <w:r>
+        <w:t xml:space="preserve"> </w:t>
+      </w:r>
+      <w:r>
+        <w:rPr>
+          <w:b/>
+          <w:bCs/>
+        </w:rPr>
+        <w:t xml:space="preserve">measured end-to-end wall-clock and peak memory</w:t>
+      </w:r>
+      <w:r>
+        <w:t xml:space="preserve"> </w:t>
+      </w:r>
+      <w:r>
+        <w:t xml:space="preserve">for the full three-engine pipeline: Wine (n=178) 29 s / 0.6 GB, MFeat (n=2000) 102 s / 0.7 GB, USPS (n=9298) 200 s / 1.8 GB. (Sec.</w:t>
+      </w:r>
+      <w:r>
+        <w:t xml:space="preserve"> </w:t>
+      </w:r>
+      <w:r>
+        <w:t xml:space="preserve">“Computational Complexity”</w:t>
+      </w:r>
+      <w:r>
+        <w:t xml:space="preserve">; Table</w:t>
+      </w:r>
+      <w:r>
+        <w:t xml:space="preserve"> </w:t>
+      </w:r>
+      <w:r>
+        <w:t xml:space="preserve">“complexity”</w:t>
+      </w:r>
+      <w:r>
         <w:t xml:space="preserve">.)</w:t>
       </w:r>
     </w:p>
@@ -665,58 +726,6 @@
           <w:b/>
           <w:bCs/>
         </w:rPr>
-        <w:t xml:space="preserve">R1.7 — Table 13 labels t-SNE O(n²) yet the total sub-quadratic; provide measured timing and peak memory.</w:t>
-      </w:r>
-      <w:r>
-        <w:t xml:space="preserve"> </w:t>
-      </w:r>
-      <w:r>
-        <w:t xml:space="preserve">The complexity table is corrected: t-SNE uses the Barnes–Hut approximation (output dimension ≤3), which is O(n log n); the sub-quadratic total then holds, with the O(nk²) SNN term dominating. We add</w:t>
-      </w:r>
-      <w:r>
-        <w:t xml:space="preserve"> </w:t>
-      </w:r>
-      <w:r>
-        <w:rPr>
-          <w:b/>
-          <w:bCs/>
-        </w:rPr>
-        <w:t xml:space="preserve">measured end-to-end wall-clock and peak memory</w:t>
-      </w:r>
-      <w:r>
-        <w:t xml:space="preserve"> </w:t>
-      </w:r>
-      <w:r>
-        <w:t xml:space="preserve">for the full three-engine pipeline: Wine (n=178) 29 s / 0.6 GB, MFeat (n=2000) 102 s / 0.7 GB, USPS (n=9298) 200 s / 1.8 GB. (Sec.</w:t>
-      </w:r>
-      <w:r>
-        <w:t xml:space="preserve"> </w:t>
-      </w:r>
-      <w:r>
-        <w:t xml:space="preserve">“Computational Complexity”</w:t>
-      </w:r>
-      <w:r>
-        <w:t xml:space="preserve">; Table</w:t>
-      </w:r>
-      <w:r>
-        <w:t xml:space="preserve"> </w:t>
-      </w:r>
-      <w:r>
-        <w:t xml:space="preserve">“complexity”</w:t>
-      </w:r>
-      <w:r>
-        <w:t xml:space="preserve">.)</w:t>
-      </w:r>
-    </w:p>
-    <w:p>
-      <w:pPr>
-        <w:pStyle w:val="BodyText"/>
-      </w:pPr>
-      <w:r>
-        <w:rPr>
-          <w:b/>
-          <w:bCs/>
-        </w:rPr>
         <w:t xml:space="preserve">R1.8 — Specify the executable algorithm;</w:t>
       </w:r>
       <w:r>
@@ -744,19 +753,127 @@
         <w:t xml:space="preserve"> </w:t>
       </w:r>
       <w:r>
-        <w:t xml:space="preserve">The</w:t>
-      </w:r>
-      <w:r>
-        <w:t xml:space="preserve"> </w:t>
-      </w:r>
-      <w:r>
-        <w:t xml:space="preserve">“hybrid H”</w:t>
-      </w:r>
-      <w:r>
-        <w:t xml:space="preserve"> </w:t>
-      </w:r>
-      <w:r>
-        <w:t xml:space="preserve">term and the r-as-pruning mislabel were artifacts of the earlier draft and are absent in the revised text (q is pruning, r is the Leiden resolution throughout). The gate description now matches the</w:t>
+        <w:t xml:space="preserve">The parameter-definition conflict is resolved in</w:t>
+      </w:r>
+      <w:r>
+        <w:t xml:space="preserve"> </w:t>
+      </w:r>
+      <w:r>
+        <w:rPr>
+          <w:b/>
+          <w:bCs/>
+        </w:rPr>
+        <w:t xml:space="preserve">both the text and the schematics</w:t>
+      </w:r>
+      <w:r>
+        <w:t xml:space="preserve">: Figures 3 and 4 now label</w:t>
+      </w:r>
+      <w:r>
+        <w:t xml:space="preserve"> </w:t>
+      </w:r>
+      <w:r>
+        <w:rPr>
+          <w:b/>
+          <w:bCs/>
+        </w:rPr>
+        <w:t xml:space="preserve">q as the pruning quantile and r as the Leiden resolution</w:t>
+      </w:r>
+      <w:r>
+        <w:t xml:space="preserve"> </w:t>
+      </w:r>
+      <w:r>
+        <w:t xml:space="preserve">(the earlier</w:t>
+      </w:r>
+      <w:r>
+        <w:t xml:space="preserve"> </w:t>
+      </w:r>
+      <w:r>
+        <w:t xml:space="preserve">“r = pruning ratio”</w:t>
+      </w:r>
+      <w:r>
+        <w:t xml:space="preserve"> </w:t>
+      </w:r>
+      <w:r>
+        <w:t xml:space="preserve">/</w:t>
+      </w:r>
+      <w:r>
+        <w:t xml:space="preserve"> </w:t>
+      </w:r>
+      <w:r>
+        <w:t xml:space="preserve">“q = quantile level”</w:t>
+      </w:r>
+      <w:r>
+        <w:t xml:space="preserve"> </w:t>
+      </w:r>
+      <w:r>
+        <w:t xml:space="preserve">labels are removed), matching the released code (</w:t>
+      </w:r>
+      <w:r>
+        <w:rPr>
+          <w:rStyle w:val="VerbatimChar"/>
+        </w:rPr>
+        <w:t xml:space="preserve">fast_amr_de.py</w:t>
+      </w:r>
+      <w:r>
+        <w:t xml:space="preserve">, where</w:t>
+      </w:r>
+      <w:r>
+        <w:t xml:space="preserve"> </w:t>
+      </w:r>
+      <w:r>
+        <w:rPr>
+          <w:rStyle w:val="VerbatimChar"/>
+        </w:rPr>
+        <w:t xml:space="preserve">vec[2]</w:t>
+      </w:r>
+      <w:r>
+        <w:t xml:space="preserve"> </w:t>
+      </w:r>
+      <w:r>
+        <w:t xml:space="preserve">is the pruning quantile and</w:t>
+      </w:r>
+      <w:r>
+        <w:t xml:space="preserve"> </w:t>
+      </w:r>
+      <w:r>
+        <w:rPr>
+          <w:rStyle w:val="VerbatimChar"/>
+        </w:rPr>
+        <w:t xml:space="preserve">vec[3]</w:t>
+      </w:r>
+      <w:r>
+        <w:t xml:space="preserve"> </w:t>
+      </w:r>
+      <w:r>
+        <w:t xml:space="preserve">is the resolution). The</w:t>
+      </w:r>
+      <w:r>
+        <w:t xml:space="preserve"> </w:t>
+      </w:r>
+      <w:r>
+        <w:t xml:space="preserve">“hybrid candidate H”</w:t>
+      </w:r>
+      <w:r>
+        <w:t xml:space="preserve"> </w:t>
+      </w:r>
+      <w:r>
+        <w:t xml:space="preserve">is now defined explicitly where the gate is introduced:</w:t>
+      </w:r>
+      <w:r>
+        <w:t xml:space="preserve"> </w:t>
+      </w:r>
+      <w:r>
+        <w:rPr>
+          <w:b/>
+          <w:bCs/>
+        </w:rPr>
+        <w:t xml:space="preserve">B is the baseline partition and H is whichever engine output (AMR-DE or EMR-CGC) scores higher internally; the gate accepts H only if it clears all three layers, else falls back to B.</w:t>
+      </w:r>
+      <w:r>
+        <w:t xml:space="preserve"> </w:t>
+      </w:r>
+      <w:r>
+        <w:t xml:space="preserve">The gate description matches the</w:t>
       </w:r>
       <w:r>
         <w:t xml:space="preserve"> </w:t>
@@ -772,7 +889,7 @@
         <w:t xml:space="preserve"> </w:t>
       </w:r>
       <w:r>
-        <w:t xml:space="preserve">— among ρ-eligible engines, select the highest internal score (0.40 MOD + 0.35 SIL + 0.25 BAL) — and notes that the Δs and regression checks are conservative safeguards that rarely bind (shown in the sensitivity analysis). The exact score normalizations, search bounds, integer rounding, graph bridging, and small-community merging are provided in the</w:t>
+        <w:t xml:space="preserve">— among ρ-eligible engines, select the highest internal score (0.40 MOD + 0.35 SIL + 0.25 BAL) — with the Δs and regression checks as conservative safeguards that rarely bind (sensitivity analysis). The exact score normalisations, search bounds, integer rounding, graph bridging, and small-community merging are in the</w:t>
       </w:r>
       <w:r>
         <w:t xml:space="preserve"> </w:t>
@@ -785,7 +902,16 @@
         <w:t xml:space="preserve">released reference implementation</w:t>
       </w:r>
       <w:r>
-        <w:t xml:space="preserve">. (Sec.</w:t>
+        <w:t xml:space="preserve">. (Secs.</w:t>
+      </w:r>
+      <w:r>
+        <w:t xml:space="preserve"> </w:t>
+      </w:r>
+      <w:r>
+        <w:t xml:space="preserve">“QualityGate”</w:t>
+      </w:r>
+      <w:r>
+        <w:t xml:space="preserve">,</w:t>
       </w:r>
       <w:r>
         <w:t xml:space="preserve"> </w:t>
@@ -794,7 +920,7 @@
         <w:t xml:space="preserve">“Design Rationale”</w:t>
       </w:r>
       <w:r>
-        <w:t xml:space="preserve">; code repository.)</w:t>
+        <w:t xml:space="preserve">; Figs. 3–4; code repository.)</w:t>
       </w:r>
     </w:p>
     <w:p>
@@ -1284,16 +1410,209 @@
         </w:pict>
       </w:r>
     </w:p>
+    <w:bookmarkEnd w:id="11"/>
+    <w:bookmarkStart w:id="12" w:name="additional-comments-editorial"/>
+    <w:p>
+      <w:pPr>
+        <w:pStyle w:val="Heading2"/>
+      </w:pPr>
+      <w:r>
+        <w:t xml:space="preserve">Additional Comments (Editorial)</w:t>
+      </w:r>
+    </w:p>
     <w:p>
       <w:pPr>
         <w:pStyle w:val="FirstParagraph"/>
       </w:pPr>
       <w:r>
+        <w:rPr>
+          <w:b/>
+          <w:bCs/>
+        </w:rPr>
+        <w:t xml:space="preserve">A1 — Tables and figures must be cited, provided with legends, and numbered serially.</w:t>
+      </w:r>
+      <w:r>
+        <w:t xml:space="preserve"> </w:t>
+      </w:r>
+      <w:r>
+        <w:t xml:space="preserve">Every figure and table is now</w:t>
+      </w:r>
+      <w:r>
+        <w:t xml:space="preserve"> </w:t>
+      </w:r>
+      <w:r>
+        <w:rPr>
+          <w:b/>
+          <w:bCs/>
+        </w:rPr>
+        <w:t xml:space="preserve">cited in the running text</w:t>
+      </w:r>
+      <w:r>
+        <w:t xml:space="preserve"> </w:t>
+      </w:r>
+      <w:r>
+        <w:t xml:space="preserve">(Fig. 1–11 and Table 1–19 are each referenced where they are discussed), carries a</w:t>
+      </w:r>
+      <w:r>
+        <w:t xml:space="preserve"> </w:t>
+      </w:r>
+      <w:r>
+        <w:rPr>
+          <w:b/>
+          <w:bCs/>
+        </w:rPr>
+        <w:t xml:space="preserve">legend</w:t>
+      </w:r>
+      <w:r>
+        <w:t xml:space="preserve">, and is</w:t>
+      </w:r>
+      <w:r>
+        <w:t xml:space="preserve"> </w:t>
+      </w:r>
+      <w:r>
+        <w:rPr>
+          <w:b/>
+          <w:bCs/>
+        </w:rPr>
+        <w:t xml:space="preserve">numbered serially</w:t>
+      </w:r>
+      <w:r>
+        <w:t xml:space="preserve">. Figure captions appear centred below the figure and table titles centred above the table, in the</w:t>
+      </w:r>
+      <w:r>
+        <w:t xml:space="preserve"> </w:t>
+      </w:r>
+      <w:r>
+        <w:t xml:space="preserve">“Fig. N.”</w:t>
+      </w:r>
+      <w:r>
+        <w:t xml:space="preserve"> </w:t>
+      </w:r>
+      <w:r>
+        <w:t xml:space="preserve">/</w:t>
+      </w:r>
+      <w:r>
+        <w:t xml:space="preserve"> </w:t>
+      </w:r>
+      <w:r>
+        <w:t xml:space="preserve">“Table N.”</w:t>
+      </w:r>
+      <w:r>
+        <w:t xml:space="preserve"> </w:t>
+      </w:r>
+      <w:r>
+        <w:t xml:space="preserve">form. In-text reference citations, which were missing from the Word export, are restored and numbered ([1]–[34]).</w:t>
+      </w:r>
+    </w:p>
+    <w:p>
+      <w:r>
+        <w:pict>
+          <v:rect style="width:0;height:1.5pt" o:hralign="center" o:hrstd="t" o:hr="t"/>
+        </w:pict>
+      </w:r>
+    </w:p>
+    <w:bookmarkEnd w:id="12"/>
+    <w:bookmarkStart w:id="13" w:name="formatting"/>
+    <w:p>
+      <w:pPr>
+        <w:pStyle w:val="Heading2"/>
+      </w:pPr>
+      <w:r>
+        <w:t xml:space="preserve">Formatting</w:t>
+      </w:r>
+    </w:p>
+    <w:p>
+      <w:pPr>
+        <w:pStyle w:val="FirstParagraph"/>
+      </w:pPr>
+      <w:r>
+        <w:t xml:space="preserve">The manuscript has been reformatted to the official</w:t>
+      </w:r>
+      <w:r>
+        <w:t xml:space="preserve"> </w:t>
+      </w:r>
+      <w:r>
+        <w:rPr>
+          <w:b/>
+          <w:bCs/>
+        </w:rPr>
+        <w:t xml:space="preserve">IJIES template (Ver. 2026.10.1,</w:t>
+      </w:r>
+      <w:r>
+        <w:rPr>
+          <w:b/>
+          <w:bCs/>
+        </w:rPr>
+        <w:t xml:space="preserve"> </w:t>
+      </w:r>
+      <w:r>
+        <w:rPr>
+          <w:rStyle w:val="VerbatimChar"/>
+          <w:b/>
+          <w:bCs/>
+        </w:rPr>
+        <w:t xml:space="preserve">IJIES_Format.docx</w:t>
+      </w:r>
+      <w:r>
+        <w:rPr>
+          <w:b/>
+          <w:bCs/>
+        </w:rPr>
+        <w:t xml:space="preserve">)</w:t>
+      </w:r>
+      <w:r>
+        <w:t xml:space="preserve">: A4 two-column layout within the prescribed print area; Times New Roman throughout (14 pt title, 11 pt author, 11 pt body, 10 pt abstract/keywords/captions, 12/11/10 pt headings); numbered first-order headings with a period; the required</w:t>
+      </w:r>
+      <w:r>
+        <w:t xml:space="preserve"> </w:t>
+      </w:r>
+      <w:r>
+        <w:rPr>
+          <w:b/>
+          <w:bCs/>
+        </w:rPr>
+        <w:t xml:space="preserve">Conflicts of Interest</w:t>
+      </w:r>
+      <w:r>
+        <w:t xml:space="preserve"> </w:t>
+      </w:r>
+      <w:r>
+        <w:t xml:space="preserve">and</w:t>
+      </w:r>
+      <w:r>
+        <w:t xml:space="preserve"> </w:t>
+      </w:r>
+      <w:r>
+        <w:rPr>
+          <w:b/>
+          <w:bCs/>
+        </w:rPr>
+        <w:t xml:space="preserve">Acknowledgments</w:t>
+      </w:r>
+      <w:r>
+        <w:t xml:space="preserve"> </w:t>
+      </w:r>
+      <w:r>
+        <w:t xml:space="preserve">statements; and the IJIES reference style. No figure, table, or equation extends beyond the print area.</w:t>
+      </w:r>
+    </w:p>
+    <w:p>
+      <w:r>
+        <w:pict>
+          <v:rect style="width:0;height:1.5pt" o:hralign="center" o:hrstd="t" o:hr="t"/>
+        </w:pict>
+      </w:r>
+    </w:p>
+    <w:p>
+      <w:pPr>
+        <w:pStyle w:val="FirstParagraph"/>
+      </w:pPr>
+      <w:r>
         <w:t xml:space="preserve">We believe these revisions address every point and make the paper’s evidence internally consistent and reproducible. We thank the reviewers again for feedback that materially improved the work.</w:t>
       </w:r>
     </w:p>
-    <w:bookmarkEnd w:id="11"/>
-    <w:bookmarkEnd w:id="12"/>
+    <w:bookmarkEnd w:id="13"/>
+    <w:bookmarkEnd w:id="14"/>
     <w:sectPr>
       <w:footnotePr>
         <w:numRestart w:val="eachSect"/>

</xml_diff>